<commit_message>
docs: update paper and readme authors to Om Shelke and Shams Tabrez Ahmed
</commit_message>
<xml_diff>
--- a/AI Resume Analyzer and Job Recommendation System A Machine Learning Approach.docx
+++ b/AI Resume Analyzer and Job Recommendation System A Machine Learning Approach.docx
@@ -13,13 +13,7 @@
     <w:p>
       <w:pPr/>
       <w:r>
-        <w:rPr>
-          <w:b/>
-        </w:rPr>
-        <w:t xml:space="preserve">Authors:</w:t>
-      </w:r>
-      <w:r>
-        <w:t xml:space="preserve"> Om Shelke (25102B2011), Aditya Vibhute (25102B2006)</w:t>
+        <w:t>Authors: Om Shelke, Shams Tabrez Ahmed</w:t>
       </w:r>
     </w:p>
     <w:p>

</xml_diff>